<commit_message>
Add sigmoid & softmax scoring to report
Compute sigmoid and softmax probabilities from total_utility and include them in the top-5 product-combination table (replacing the previous logistic/normalized columns). Import numpy, update table column names and rounding, and add explanatory paragraphs describing the difference between sigmoid (single-point score) and softmax (relative choice probability) and the saturation/normalization issue. Regenerate the Word report output accordingly.
</commit_message>
<xml_diff>
--- a/output/Urbaner_Amazon_Analysis_Report.docx
+++ b/output/Urbaner_Amazon_Analysis_Report.docx
@@ -3672,7 +3672,7 @@
               <w:rPr>
                 <w:rFonts w:ascii="標楷體" w:hAnsi="標楷體" w:eastAsia="標楷體"/>
               </w:rPr>
-              <w:t>logistic 機率</w:t>
+              <w:t>sigmoid 分數</w:t>
             </w:r>
           </w:p>
         </w:tc>
@@ -3686,7 +3686,7 @@
               <w:rPr>
                 <w:rFonts w:ascii="標楷體" w:hAnsi="標楷體" w:eastAsia="標楷體"/>
               </w:rPr>
-              <w:t>標準化機率</w:t>
+              <w:t>softmax 機率</w:t>
             </w:r>
           </w:p>
         </w:tc>
@@ -3780,7 +3780,7 @@
               <w:rPr>
                 <w:rFonts w:ascii="標楷體" w:hAnsi="標楷體" w:eastAsia="標楷體"/>
               </w:rPr>
-              <w:t>0.055714</w:t>
+              <w:t>0.135926</w:t>
             </w:r>
           </w:p>
         </w:tc>
@@ -3873,7 +3873,7 @@
               <w:rPr>
                 <w:rFonts w:ascii="標楷體" w:hAnsi="標楷體" w:eastAsia="標楷體"/>
               </w:rPr>
-              <w:t>0.055713</w:t>
+              <w:t>0.131777</w:t>
             </w:r>
           </w:p>
         </w:tc>
@@ -3966,7 +3966,7 @@
               <w:rPr>
                 <w:rFonts w:ascii="標楷體" w:hAnsi="標楷體" w:eastAsia="標楷體"/>
               </w:rPr>
-              <w:t>0.055705</w:t>
+              <w:t>0.111845</w:t>
             </w:r>
           </w:p>
         </w:tc>
@@ -4059,7 +4059,7 @@
               <w:rPr>
                 <w:rFonts w:ascii="標楷體" w:hAnsi="標楷體" w:eastAsia="標楷體"/>
               </w:rPr>
-              <w:t>0.055695</w:t>
+              <w:t>0.092491</w:t>
             </w:r>
           </w:p>
         </w:tc>
@@ -4152,7 +4152,7 @@
               <w:rPr>
                 <w:rFonts w:ascii="標楷體" w:hAnsi="標楷體" w:eastAsia="標楷體"/>
               </w:rPr>
-              <w:t>0.055682</w:t>
+              <w:t>0.076947</w:t>
             </w:r>
           </w:p>
         </w:tc>
@@ -4171,6 +4171,26 @@
         </w:tc>
       </w:tr>
     </w:tbl>
+    <w:p>
+      <w:r>
+        <w:rPr>
+          <w:rFonts w:ascii="標楷體" w:hAnsi="標楷體" w:eastAsia="標楷體"/>
+          <w:b w:val="0"/>
+          <w:i w:val="0"/>
+        </w:rPr>
+        <w:t>機率欄位說明：sigmoid 分數可視為效用轉換後的單點吸引力，不適合作跨方案機率比較；softmax 機率則是多方案競爭下的相對被選擇機率，較適合做組合排序與資源配置。</w:t>
+      </w:r>
+    </w:p>
+    <w:p>
+      <w:r>
+        <w:rPr>
+          <w:rFonts w:ascii="標楷體" w:hAnsi="標楷體" w:eastAsia="標楷體"/>
+          <w:b w:val="0"/>
+          <w:i w:val="0"/>
+        </w:rPr>
+        <w:t>先前表格中『標準化機率』接近 0.055 的主因是 sigmoid 已高度飽和（幾乎都接近 1），再做標準化後自然接近 1/18；這不代表方案吸引力低，而是轉換尺度造成的可讀性問題。</w:t>
+      </w:r>
+    </w:p>
     <w:p>
       <w:r>
         <w:rPr>

</xml_diff>